<commit_message>
chore: nettoyage massif + nouveaux projets (IOT, InsectNet, Nexus Acoustic)
- Suppression de ~270 artéfacts obsolètes (AI_IT_TOOLS, ARTEON, WILDNEXUS)
- Mise à jour des system pointers (ADAPTER-PROMPT, AGENTS, CLAUDE, DEEPSEEK, GEMINI)
- Nouveaux projets : 09_InsectNet, 11_IOT (iot-van/maison/serre), 12_NEXUS_ACOUSTIC
- Thread files pour tous les projets actifs
- ADRs : ADR-014 (LoRa), ADR-016 (firmware intégré P0), ADR-017 (metadata audio)
- State files : hardware-state, decisions-actives, etat-projets
- TEAM_Inbox : ~80 briefs/analyses de sessions (juin-juillet 2026)
- Nouveaux spécialistes : Mésange, Scarabée
- Nettoyage .DS_Store, gitignore firmware/ et lightroom-mcp/
- Dashboard updates (hub, kanban, organigramme)
- PDF Vetalyx Dixun déplacé dans 08_VETALYX/
</commit_message>
<xml_diff>
--- a/JCH_Inbox/03_PROJECTS/08_VETALYX/business-plan/Vetalyx_Business_Plan_FINAL.docx
+++ b/JCH_Inbox/03_PROJECTS/08_VETALYX/business-plan/Vetalyx_Business_Plan_FINAL.docx
@@ -1,6 +1,6 @@
 
 <file path=word/document.xml><?xml version="1.0" encoding="utf-8"?>
-<w:document xmlns:wpc="http://schemas.microsoft.com/office/word/2010/wordprocessingCanvas" xmlns:cx="http://schemas.microsoft.com/office/drawing/2014/chartex" xmlns:cx1="http://schemas.microsoft.com/office/drawing/2015/9/8/chartex" xmlns:cx2="http://schemas.microsoft.com/office/drawing/2015/10/21/chartex" xmlns:cx3="http://schemas.microsoft.com/office/drawing/2016/5/9/chartex" xmlns:cx4="http://schemas.microsoft.com/office/drawing/2016/5/10/chartex" xmlns:cx5="http://schemas.microsoft.com/office/drawing/2016/5/11/chartex" xmlns:cx6="http://schemas.microsoft.com/office/drawing/2016/5/12/chartex" xmlns:cx7="http://schemas.microsoft.com/office/drawing/2016/5/13/chartex" xmlns:cx8="http://schemas.microsoft.com/office/drawing/2016/5/14/chartex" xmlns:mc="http://schemas.openxmlformats.org/markup-compatibility/2006" xmlns:aink="http://schemas.microsoft.com/office/drawing/2016/ink" xmlns:am3d="http://schemas.microsoft.com/office/drawing/2017/model3d" xmlns:o="urn:schemas-microsoft-com:office:office" xmlns:oel="http://schemas.microsoft.com/office/2019/extlst" xmlns:r="http://schemas.openxmlformats.org/officeDocument/2006/relationships" xmlns:m="http://schemas.openxmlformats.org/officeDocument/2006/math" xmlns:v="urn:schemas-microsoft-com:vml" xmlns:wp14="http://schemas.microsoft.com/office/word/2010/wordprocessingDrawing" xmlns:wp="http://schemas.openxmlformats.org/drawingml/2006/wordprocessingDrawing" xmlns:w10="urn:schemas-microsoft-com:office:word" xmlns:w="http://schemas.openxmlformats.org/wordprocessingml/2006/main" xmlns:w14="http://schemas.microsoft.com/office/word/2010/wordml" xmlns:w15="http://schemas.microsoft.com/office/word/2012/wordml" xmlns:w16cex="http://schemas.microsoft.com/office/word/2018/wordml/cex" xmlns:w16cid="http://schemas.microsoft.com/office/word/2016/wordml/cid" xmlns:w16="http://schemas.microsoft.com/office/word/2018/wordml" xmlns:w16du="http://schemas.microsoft.com/office/word/2023/wordml/word16du" xmlns:w16sdtdh="http://schemas.microsoft.com/office/word/2020/wordml/sdtdatahash" xmlns:w16sdtfl="http://schemas.microsoft.com/office/word/2024/wordml/sdtformatlock" xmlns:w16se="http://schemas.microsoft.com/office/word/2015/wordml/symex" xmlns:wpg="http://schemas.microsoft.com/office/word/2010/wordprocessingGroup" xmlns:wpi="http://schemas.microsoft.com/office/word/2010/wordprocessingInk" xmlns:wne="http://schemas.microsoft.com/office/word/2006/wordml" xmlns:wps="http://schemas.microsoft.com/office/word/2010/wordprocessingShape" mc:Ignorable="w14 w15 w16se w16cid w16 w16cex w16sdtdh w16sdtfl w16du wp14">
+<w:document xmlns:wpc="http://schemas.microsoft.com/office/word/2010/wordprocessingCanvas" xmlns:cx="http://schemas.microsoft.com/office/drawing/2014/chartex" xmlns:cx1="http://schemas.microsoft.com/office/drawing/2015/9/8/chartex" xmlns:cx2="http://schemas.microsoft.com/office/drawing/2015/10/21/chartex" xmlns:cx3="http://schemas.microsoft.com/office/drawing/2016/5/9/chartex" xmlns:cx4="http://schemas.microsoft.com/office/drawing/2016/5/10/chartex" xmlns:cx5="http://schemas.microsoft.com/office/drawing/2016/5/11/chartex" xmlns:cx6="http://schemas.microsoft.com/office/drawing/2016/5/12/chartex" xmlns:cx7="http://schemas.microsoft.com/office/drawing/2016/5/13/chartex" xmlns:cx8="http://schemas.microsoft.com/office/drawing/2016/5/14/chartex" xmlns:mc="http://schemas.openxmlformats.org/markup-compatibility/2006" xmlns:m="http://schemas.openxmlformats.org/officeDocument/2006/math" xmlns:aink="http://schemas.microsoft.com/office/drawing/2016/ink" xmlns:am3d="http://schemas.microsoft.com/office/drawing/2017/model3d" xmlns:oel="http://schemas.microsoft.com/office/2019/extlst" xmlns:r="http://schemas.openxmlformats.org/officeDocument/2006/relationships" xmlns:wp14="http://schemas.microsoft.com/office/word/2010/wordprocessingDrawing" xmlns:wp="http://schemas.openxmlformats.org/drawingml/2006/wordprocessingDrawing" xmlns:wpg="http://schemas.microsoft.com/office/word/2010/wordprocessingGroup" xmlns:wpi="http://schemas.microsoft.com/office/word/2010/wordprocessingInk" xmlns:wps="http://schemas.microsoft.com/office/word/2010/wordprocessingShape" xmlns:o="urn:schemas-microsoft-com:office:office" xmlns:v="urn:schemas-microsoft-com:vml" xmlns:w10="urn:schemas-microsoft-com:office:word" xmlns:w="http://schemas.openxmlformats.org/wordprocessingml/2006/main" xmlns:w14="http://schemas.microsoft.com/office/word/2010/wordml" xmlns:w15="http://schemas.microsoft.com/office/word/2012/wordml" xmlns:w16cex="http://schemas.microsoft.com/office/word/2018/wordml/cex" xmlns:w16cid="http://schemas.microsoft.com/office/word/2016/wordml/cid" xmlns:w16="http://schemas.microsoft.com/office/word/2018/wordml" xmlns:w16sdtdh="http://schemas.microsoft.com/office/word/2020/wordml/sdtdatahash" xmlns:w16sdtfl="http://schemas.microsoft.com/office/word/2024/wordml/sdtformatlock" xmlns:w16se="http://schemas.microsoft.com/office/word/2015/wordml/symex" xmlns:w16du="http://schemas.microsoft.com/office/word/2023/wordml/word16du" xmlns:wne="http://schemas.microsoft.com/office/word/2006/wordml" mc:Ignorable="w14 w15 w16se w16cid w16 w16cex w16sdtdh w16sdtfl w16du wp14">
   <w:body>
     <w:p>
       <w:pPr>
@@ -1649,7 +1649,7 @@
                 <w:szCs w:val="32"/>
                 <w:lang w:val="en-BE" w:eastAsia="en-GB"/>
               </w:rPr>
-              <w:t>DIATECH</w:t>
+              <w:t>VETALYX</w:t>
             </w:r>
           </w:p>
         </w:tc>
@@ -3013,13 +3013,39 @@
           <w:p>
             <w:pPr>
               <w:spacing w:after="0" w:line="240" w:lineRule="auto"/>
-              <w:rPr>
-                <w:rFonts w:ascii="Times New Roman" w:eastAsia="Times New Roman" w:hAnsi="Times New Roman" w:cs="Times New Roman"/>
+              <w:jc w:val="right"/>
+              <w:rPr>
+                <w:rFonts w:ascii="Arial" w:eastAsia="Times New Roman" w:hAnsi="Arial" w:cs="Arial"/>
+                <w:color w:val="EE0000"/>
                 <w:sz w:val="20"/>
                 <w:szCs w:val="20"/>
                 <w:lang w:val="en-BE" w:eastAsia="en-GB"/>
               </w:rPr>
             </w:pPr>
+            <w:r>
+              <w:rPr>
+                <w:rFonts w:ascii="Arial" w:eastAsia="Times New Roman" w:hAnsi="Arial" w:cs="Arial"/>
+                <w:b/>
+                <w:bCs/>
+                <w:color w:val="EE0000"/>
+                <w:sz w:val="18"/>
+                <w:szCs w:val="18"/>
+                <w:lang w:val="en-BE" w:eastAsia="en-GB"/>
+              </w:rPr>
+              <w:t>TESTS SOLD</w:t>
+            </w:r>
+            <w:r>
+              <w:rPr>
+                <w:rFonts w:ascii="Arial" w:eastAsia="Times New Roman" w:hAnsi="Arial" w:cs="Arial"/>
+                <w:b/>
+                <w:bCs/>
+                <w:color w:val="EE0000"/>
+                <w:sz w:val="18"/>
+                <w:szCs w:val="18"/>
+                <w:lang w:val="en-BE" w:eastAsia="en-GB"/>
+              </w:rPr>
+              <w:t xml:space="preserve"> 50%CAT 50% DOG</w:t>
+            </w:r>
           </w:p>
         </w:tc>
         <w:tc>
@@ -3039,12 +3065,23 @@
             <w:pPr>
               <w:spacing w:after="0" w:line="240" w:lineRule="auto"/>
               <w:rPr>
-                <w:rFonts w:ascii="Times New Roman" w:eastAsia="Times New Roman" w:hAnsi="Times New Roman" w:cs="Times New Roman"/>
+                <w:rFonts w:ascii="Arial" w:eastAsia="Times New Roman" w:hAnsi="Arial" w:cs="Arial"/>
+                <w:color w:val="EE0000"/>
                 <w:sz w:val="20"/>
                 <w:szCs w:val="20"/>
                 <w:lang w:val="en-BE" w:eastAsia="en-GB"/>
               </w:rPr>
             </w:pPr>
+            <w:r>
+              <w:rPr>
+                <w:rFonts w:ascii="Arial" w:eastAsia="Times New Roman" w:hAnsi="Arial" w:cs="Arial"/>
+                <w:color w:val="EE0000"/>
+                <w:sz w:val="20"/>
+                <w:szCs w:val="20"/>
+                <w:lang w:val="en-BE" w:eastAsia="en-GB"/>
+              </w:rPr>
+              <w:t>+7.685</w:t>
+            </w:r>
           </w:p>
         </w:tc>
         <w:tc>
@@ -3064,12 +3101,23 @@
             <w:pPr>
               <w:spacing w:after="0" w:line="240" w:lineRule="auto"/>
               <w:rPr>
-                <w:rFonts w:ascii="Times New Roman" w:eastAsia="Times New Roman" w:hAnsi="Times New Roman" w:cs="Times New Roman"/>
+                <w:rFonts w:ascii="Arial" w:eastAsia="Times New Roman" w:hAnsi="Arial" w:cs="Arial"/>
+                <w:color w:val="EE0000"/>
                 <w:sz w:val="20"/>
                 <w:szCs w:val="20"/>
                 <w:lang w:val="en-BE" w:eastAsia="en-GB"/>
               </w:rPr>
             </w:pPr>
+            <w:r>
+              <w:rPr>
+                <w:rFonts w:ascii="Arial" w:eastAsia="Times New Roman" w:hAnsi="Arial" w:cs="Arial"/>
+                <w:color w:val="EE0000"/>
+                <w:sz w:val="20"/>
+                <w:szCs w:val="20"/>
+                <w:lang w:val="en-BE" w:eastAsia="en-GB"/>
+              </w:rPr>
+              <w:t>+21.952</w:t>
+            </w:r>
           </w:p>
         </w:tc>
         <w:tc>
@@ -3089,12 +3137,23 @@
             <w:pPr>
               <w:spacing w:after="0" w:line="240" w:lineRule="auto"/>
               <w:rPr>
-                <w:rFonts w:ascii="Times New Roman" w:eastAsia="Times New Roman" w:hAnsi="Times New Roman" w:cs="Times New Roman"/>
+                <w:rFonts w:ascii="Arial" w:eastAsia="Times New Roman" w:hAnsi="Arial" w:cs="Arial"/>
+                <w:color w:val="EE0000"/>
                 <w:sz w:val="20"/>
                 <w:szCs w:val="20"/>
                 <w:lang w:val="en-BE" w:eastAsia="en-GB"/>
               </w:rPr>
             </w:pPr>
+            <w:r>
+              <w:rPr>
+                <w:rFonts w:ascii="Arial" w:eastAsia="Times New Roman" w:hAnsi="Arial" w:cs="Arial"/>
+                <w:color w:val="EE0000"/>
+                <w:sz w:val="20"/>
+                <w:szCs w:val="20"/>
+                <w:lang w:val="en-BE" w:eastAsia="en-GB"/>
+              </w:rPr>
+              <w:t>+58.856</w:t>
+            </w:r>
           </w:p>
         </w:tc>
         <w:tc>
@@ -3114,12 +3173,23 @@
             <w:pPr>
               <w:spacing w:after="0" w:line="240" w:lineRule="auto"/>
               <w:rPr>
-                <w:rFonts w:ascii="Times New Roman" w:eastAsia="Times New Roman" w:hAnsi="Times New Roman" w:cs="Times New Roman"/>
+                <w:rFonts w:ascii="Arial" w:eastAsia="Times New Roman" w:hAnsi="Arial" w:cs="Arial"/>
+                <w:color w:val="EE0000"/>
                 <w:sz w:val="20"/>
                 <w:szCs w:val="20"/>
                 <w:lang w:val="en-BE" w:eastAsia="en-GB"/>
               </w:rPr>
             </w:pPr>
+            <w:r>
+              <w:rPr>
+                <w:rFonts w:ascii="Arial" w:eastAsia="Times New Roman" w:hAnsi="Arial" w:cs="Arial"/>
+                <w:color w:val="EE0000"/>
+                <w:sz w:val="20"/>
+                <w:szCs w:val="20"/>
+                <w:lang w:val="en-BE" w:eastAsia="en-GB"/>
+              </w:rPr>
+              <w:t>115.150</w:t>
+            </w:r>
           </w:p>
         </w:tc>
         <w:tc>
@@ -3139,12 +3209,23 @@
             <w:pPr>
               <w:spacing w:after="0" w:line="240" w:lineRule="auto"/>
               <w:rPr>
-                <w:rFonts w:ascii="Times New Roman" w:eastAsia="Times New Roman" w:hAnsi="Times New Roman" w:cs="Times New Roman"/>
+                <w:rFonts w:ascii="Arial" w:eastAsia="Times New Roman" w:hAnsi="Arial" w:cs="Arial"/>
+                <w:color w:val="EE0000"/>
                 <w:sz w:val="20"/>
                 <w:szCs w:val="20"/>
                 <w:lang w:val="en-BE" w:eastAsia="en-GB"/>
               </w:rPr>
             </w:pPr>
+            <w:r>
+              <w:rPr>
+                <w:rFonts w:ascii="Arial" w:eastAsia="Times New Roman" w:hAnsi="Arial" w:cs="Arial"/>
+                <w:color w:val="EE0000"/>
+                <w:sz w:val="20"/>
+                <w:szCs w:val="20"/>
+                <w:lang w:val="en-BE" w:eastAsia="en-GB"/>
+              </w:rPr>
+              <w:t>+184.861</w:t>
+            </w:r>
           </w:p>
         </w:tc>
       </w:tr>
@@ -6350,7 +6431,7 @@
 </file>
 
 <file path=word/numbering.xml><?xml version="1.0" encoding="utf-8"?>
-<w:numbering xmlns:wpc="http://schemas.microsoft.com/office/word/2010/wordprocessingCanvas" xmlns:cx="http://schemas.microsoft.com/office/drawing/2014/chartex" xmlns:cx1="http://schemas.microsoft.com/office/drawing/2015/9/8/chartex" xmlns:cx2="http://schemas.microsoft.com/office/drawing/2015/10/21/chartex" xmlns:cx3="http://schemas.microsoft.com/office/drawing/2016/5/9/chartex" xmlns:cx4="http://schemas.microsoft.com/office/drawing/2016/5/10/chartex" xmlns:cx5="http://schemas.microsoft.com/office/drawing/2016/5/11/chartex" xmlns:cx6="http://schemas.microsoft.com/office/drawing/2016/5/12/chartex" xmlns:cx7="http://schemas.microsoft.com/office/drawing/2016/5/13/chartex" xmlns:cx8="http://schemas.microsoft.com/office/drawing/2016/5/14/chartex" xmlns:mc="http://schemas.openxmlformats.org/markup-compatibility/2006" xmlns:aink="http://schemas.microsoft.com/office/drawing/2016/ink" xmlns:am3d="http://schemas.microsoft.com/office/drawing/2017/model3d" xmlns:o="urn:schemas-microsoft-com:office:office" xmlns:oel="http://schemas.microsoft.com/office/2019/extlst" xmlns:r="http://schemas.openxmlformats.org/officeDocument/2006/relationships" xmlns:m="http://schemas.openxmlformats.org/officeDocument/2006/math" xmlns:v="urn:schemas-microsoft-com:vml" xmlns:wp14="http://schemas.microsoft.com/office/word/2010/wordprocessingDrawing" xmlns:wp="http://schemas.openxmlformats.org/drawingml/2006/wordprocessingDrawing" xmlns:w10="urn:schemas-microsoft-com:office:word" xmlns:w="http://schemas.openxmlformats.org/wordprocessingml/2006/main" xmlns:w14="http://schemas.microsoft.com/office/word/2010/wordml" xmlns:w15="http://schemas.microsoft.com/office/word/2012/wordml" xmlns:w16cex="http://schemas.microsoft.com/office/word/2018/wordml/cex" xmlns:w16cid="http://schemas.microsoft.com/office/word/2016/wordml/cid" xmlns:w16="http://schemas.microsoft.com/office/word/2018/wordml" xmlns:w16du="http://schemas.microsoft.com/office/word/2023/wordml/word16du" xmlns:w16sdtdh="http://schemas.microsoft.com/office/word/2020/wordml/sdtdatahash" xmlns:w16sdtfl="http://schemas.microsoft.com/office/word/2024/wordml/sdtformatlock" xmlns:w16se="http://schemas.microsoft.com/office/word/2015/wordml/symex" xmlns:wpg="http://schemas.microsoft.com/office/word/2010/wordprocessingGroup" xmlns:wpi="http://schemas.microsoft.com/office/word/2010/wordprocessingInk" xmlns:wne="http://schemas.microsoft.com/office/word/2006/wordml" xmlns:wps="http://schemas.microsoft.com/office/word/2010/wordprocessingShape" mc:Ignorable="w14 w15 w16se w16cid w16 w16cex w16sdtdh w16sdtfl w16du wp14">
+<w:numbering xmlns:wpc="http://schemas.microsoft.com/office/word/2010/wordprocessingCanvas" xmlns:cx="http://schemas.microsoft.com/office/drawing/2014/chartex" xmlns:cx1="http://schemas.microsoft.com/office/drawing/2015/9/8/chartex" xmlns:cx2="http://schemas.microsoft.com/office/drawing/2015/10/21/chartex" xmlns:cx3="http://schemas.microsoft.com/office/drawing/2016/5/9/chartex" xmlns:cx4="http://schemas.microsoft.com/office/drawing/2016/5/10/chartex" xmlns:cx5="http://schemas.microsoft.com/office/drawing/2016/5/11/chartex" xmlns:cx6="http://schemas.microsoft.com/office/drawing/2016/5/12/chartex" xmlns:cx7="http://schemas.microsoft.com/office/drawing/2016/5/13/chartex" xmlns:cx8="http://schemas.microsoft.com/office/drawing/2016/5/14/chartex" xmlns:mc="http://schemas.openxmlformats.org/markup-compatibility/2006" xmlns:m="http://schemas.openxmlformats.org/officeDocument/2006/math" xmlns:aink="http://schemas.microsoft.com/office/drawing/2016/ink" xmlns:am3d="http://schemas.microsoft.com/office/drawing/2017/model3d" xmlns:oel="http://schemas.microsoft.com/office/2019/extlst" xmlns:r="http://schemas.openxmlformats.org/officeDocument/2006/relationships" xmlns:wp14="http://schemas.microsoft.com/office/word/2010/wordprocessingDrawing" xmlns:wp="http://schemas.openxmlformats.org/drawingml/2006/wordprocessingDrawing" xmlns:wpg="http://schemas.microsoft.com/office/word/2010/wordprocessingGroup" xmlns:wpi="http://schemas.microsoft.com/office/word/2010/wordprocessingInk" xmlns:wps="http://schemas.microsoft.com/office/word/2010/wordprocessingShape" xmlns:o="urn:schemas-microsoft-com:office:office" xmlns:v="urn:schemas-microsoft-com:vml" xmlns:w10="urn:schemas-microsoft-com:office:word" xmlns:w="http://schemas.openxmlformats.org/wordprocessingml/2006/main" xmlns:w14="http://schemas.microsoft.com/office/word/2010/wordml" xmlns:w15="http://schemas.microsoft.com/office/word/2012/wordml" xmlns:w16cex="http://schemas.microsoft.com/office/word/2018/wordml/cex" xmlns:w16cid="http://schemas.microsoft.com/office/word/2016/wordml/cid" xmlns:w16="http://schemas.microsoft.com/office/word/2018/wordml" xmlns:w16sdtdh="http://schemas.microsoft.com/office/word/2020/wordml/sdtdatahash" xmlns:w16sdtfl="http://schemas.microsoft.com/office/word/2024/wordml/sdtformatlock" xmlns:w16se="http://schemas.microsoft.com/office/word/2015/wordml/symex" xmlns:w16du="http://schemas.microsoft.com/office/word/2023/wordml/word16du" xmlns:wne="http://schemas.microsoft.com/office/word/2006/wordml" mc:Ignorable="w14 w15 w16se w16cid w16 w16cex w16sdtdh w16sdtfl w16du wp14">
   <w:abstractNum w:abstractNumId="0" w15:restartNumberingAfterBreak="0">
     <w:nsid w:val="FFFFFF7C"/>
     <w:multiLevelType w:val="singleLevel"/>
@@ -6669,7 +6750,7 @@
 </file>
 
 <file path=word/styles.xml><?xml version="1.0" encoding="utf-8"?>
-<w:styles xmlns:mc="http://schemas.openxmlformats.org/markup-compatibility/2006" xmlns:r="http://schemas.openxmlformats.org/officeDocument/2006/relationships" xmlns:w="http://schemas.openxmlformats.org/wordprocessingml/2006/main" xmlns:w14="http://schemas.microsoft.com/office/word/2010/wordml" xmlns:w15="http://schemas.microsoft.com/office/word/2012/wordml" xmlns:w16cex="http://schemas.microsoft.com/office/word/2018/wordml/cex" xmlns:w16cid="http://schemas.microsoft.com/office/word/2016/wordml/cid" xmlns:w16="http://schemas.microsoft.com/office/word/2018/wordml" xmlns:w16du="http://schemas.microsoft.com/office/word/2023/wordml/word16du" xmlns:w16sdtdh="http://schemas.microsoft.com/office/word/2020/wordml/sdtdatahash" xmlns:w16sdtfl="http://schemas.microsoft.com/office/word/2024/wordml/sdtformatlock" xmlns:w16se="http://schemas.microsoft.com/office/word/2015/wordml/symex" mc:Ignorable="w14 w15 w16se w16cid w16 w16cex w16sdtdh w16sdtfl w16du">
+<w:styles xmlns:mc="http://schemas.openxmlformats.org/markup-compatibility/2006" xmlns:r="http://schemas.openxmlformats.org/officeDocument/2006/relationships" xmlns:w="http://schemas.openxmlformats.org/wordprocessingml/2006/main" xmlns:w14="http://schemas.microsoft.com/office/word/2010/wordml" xmlns:w15="http://schemas.microsoft.com/office/word/2012/wordml" xmlns:w16cex="http://schemas.microsoft.com/office/word/2018/wordml/cex" xmlns:w16cid="http://schemas.microsoft.com/office/word/2016/wordml/cid" xmlns:w16="http://schemas.microsoft.com/office/word/2018/wordml" xmlns:w16sdtdh="http://schemas.microsoft.com/office/word/2020/wordml/sdtdatahash" xmlns:w16sdtfl="http://schemas.microsoft.com/office/word/2024/wordml/sdtformatlock" xmlns:w16se="http://schemas.microsoft.com/office/word/2015/wordml/symex" xmlns:w16du="http://schemas.microsoft.com/office/word/2023/wordml/word16du" mc:Ignorable="w14 w15 w16se w16cid w16 w16cex w16sdtdh w16sdtfl w16du">
   <w:docDefaults>
     <w:rPrDefault>
       <w:rPr>

</xml_diff>